<commit_message>
HMI 3.0.0.6 - radial snags done, standard T620 to check!
</commit_message>
<xml_diff>
--- a/snags.docx
+++ b/snags.docx
@@ -42,6 +42,9 @@
         </w:numPr>
       </w:pPr>
       <w:r>
+        <w:t xml:space="preserve">DONE </w:t>
+      </w:r>
+      <w:r>
         <w:t>Manual Force when Tech logged in BOTH - Can we NOT ALLOW a forced output on the following OUT0200, OUT0201, OUT0203, OUT0204, OUT0205, OUT0104 - these are all for tracking outputs, I just feel that these would be better disabled for safety reasons if the Tech logged in had the engine started</w:t>
       </w:r>
     </w:p>
@@ -58,6 +61,9 @@
         </w:numPr>
       </w:pPr>
       <w:r>
+        <w:t xml:space="preserve">DONE </w:t>
+      </w:r>
+      <w:r>
         <w:t xml:space="preserve">Tech logged in BOTH - I would like the software changed so when a Tech is logged in then the siren/beacon output fires the whole time when logged in </w:t>
       </w:r>
       <w:proofErr w:type="gramStart"/>
@@ -99,15 +105,10 @@
         </w:numPr>
       </w:pPr>
       <w:r>
-        <w:t xml:space="preserve">Side </w:t>
-      </w:r>
-      <w:proofErr w:type="gramStart"/>
-      <w:r>
-        <w:t>conveyor</w:t>
-      </w:r>
-      <w:proofErr w:type="gramEnd"/>
-      <w:r>
-        <w:t xml:space="preserve"> raise/lower T620X - These are activating too early </w:t>
+        <w:t xml:space="preserve">TBC </w:t>
+      </w:r>
+      <w:r>
+        <w:t xml:space="preserve">Side conveyor raise/lower T620X - These are activating too early </w:t>
       </w:r>
       <w:proofErr w:type="gramStart"/>
       <w:r>
@@ -134,6 +135,9 @@
         </w:numPr>
       </w:pPr>
       <w:r>
+        <w:t xml:space="preserve">DONE </w:t>
+      </w:r>
+      <w:r>
         <w:t xml:space="preserve">Jack legs raise/lower BOTH - These are activating too early </w:t>
       </w:r>
       <w:proofErr w:type="gramStart"/>
@@ -161,6 +165,9 @@
         </w:numPr>
       </w:pPr>
       <w:r>
+        <w:t xml:space="preserve">DONE - </w:t>
+      </w:r>
+      <w:r>
         <w:t xml:space="preserve">Auto tracking time delay BOTH - Can we extend the tracking output functions slightly. When in auto run mode and we press the tracking on/off button, for </w:t>
       </w:r>
       <w:proofErr w:type="spellStart"/>
@@ -188,6 +195,9 @@
         </w:numPr>
       </w:pPr>
       <w:r>
+        <w:t xml:space="preserve">DONE </w:t>
+      </w:r>
+      <w:r>
         <w:t>Tracking mode rpm setting BOTH - when Tech logged in, and changing this setting, the max I can go is set at 1300rpm. It needs to be 1400. </w:t>
       </w:r>
     </w:p>
@@ -199,6 +209,9 @@
         </w:numPr>
       </w:pPr>
       <w:r>
+        <w:t xml:space="preserve">DONE </w:t>
+      </w:r>
+      <w:r>
         <w:t xml:space="preserve">E-stop </w:t>
       </w:r>
       <w:proofErr w:type="gramStart"/>
@@ -218,7 +231,26 @@
         </w:numPr>
       </w:pPr>
       <w:r>
-        <w:t>Manual slew left/right T620R - Can we add a bit to the software so if the machine is running in auto or manual ( NOT AUTO RADIAL -BELT JUST STAYING IN ONE POSITION ) if the operator presses either left or right input from radio then if the conveyor triggers either of the left or right limit switches then the movement stops, also when running in auto mode and they press the left or right movement then can we change the software so that the machine does not go into auto stop mode.</w:t>
+        <w:t xml:space="preserve">DONE </w:t>
+      </w:r>
+      <w:r>
+        <w:t xml:space="preserve">Manual slew left/right T620R - Can we add a bit to the software so if the machine is running in auto or manual </w:t>
+      </w:r>
+      <w:proofErr w:type="gramStart"/>
+      <w:r>
+        <w:t>( NOT</w:t>
+      </w:r>
+      <w:proofErr w:type="gramEnd"/>
+      <w:r>
+        <w:t xml:space="preserve"> AUTO RADIAL -BELT JUST STAYING IN ONE </w:t>
+      </w:r>
+      <w:proofErr w:type="gramStart"/>
+      <w:r>
+        <w:t>POSITION )</w:t>
+      </w:r>
+      <w:proofErr w:type="gramEnd"/>
+      <w:r>
+        <w:t xml:space="preserve"> if the operator presses either left or right input from radio then if the conveyor triggers either of the left or right limit switches then the movement stops, </w:t>
       </w:r>
     </w:p>
     <w:p>
@@ -228,6 +260,23 @@
           <w:numId w:val="2"/>
         </w:numPr>
       </w:pPr>
+      <w:r>
+        <w:t xml:space="preserve">DONE </w:t>
+      </w:r>
+      <w:r>
+        <w:t>also when running in auto mode and they press the left or right movement then can we change the software so that the machine does not go into auto stop mode.</w:t>
+      </w:r>
+    </w:p>
+    <w:p>
+      <w:pPr>
+        <w:numPr>
+          <w:ilvl w:val="0"/>
+          <w:numId w:val="2"/>
+        </w:numPr>
+      </w:pPr>
+      <w:r>
+        <w:t xml:space="preserve">DONE </w:t>
+      </w:r>
       <w:r>
         <w:t>Auto radial Mode T620R - if machine running in auto radial mode, then ignore inputs from left and right buttons on the radio remote to manually move conveyor either left or right.</w:t>
       </w:r>
@@ -1257,6 +1306,7 @@
   <w:style w:type="character" w:default="1" w:styleId="DefaultParagraphFont">
     <w:name w:val="Default Paragraph Font"/>
     <w:uiPriority w:val="1"/>
+    <w:semiHidden/>
     <w:unhideWhenUsed/>
   </w:style>
   <w:style w:type="table" w:default="1" w:styleId="TableNormal">

</xml_diff>